<commit_message>
Correct school for roll 71126059 (order 3846); queue resend
Co-Authored-By: Claude Opus 5.5 <noreply@anthropic.com>
</commit_message>
<xml_diff>
--- a/Admit_Cards_2026/DOCX/Admit_71126059.docx
+++ b/Admit_Cards_2026/DOCX/Admit_71126059.docx
@@ -245,10 +245,8 @@
                 <w:b w:val="0"/>
                 <w:sz w:val="24"/>
                 <w:szCs w:val="24"/>
-                <w:cs/>
-                <w:lang w:bidi="bn-IN"/>
-              </w:rPr>
-              <w:t xml:space="preserve">মোঃ আরিফুল ইসলাম</w:t>
+              </w:rPr>
+              <w:t xml:space="preserve">Chattogram Collegiate School</w:t>
             </w:r>
           </w:p>
         </w:tc>

</xml_diff>